<commit_message>
refactor: optimize Python analysis pipeline and clean up old scripts
- Combine statistical analysis and AI insights into a single main_analyzer.py for faster execution
- Add automated .docx Word report generation directly to main_analyzer.py
- Remove redundant/obsolete Python scripts (analyzer.py, report_generator.py, analyze_data.py, etc.)
- Update oute.ts to use integrated analyzer and improve error handling
- Enforce strict process.cwd() absolute paths for robust deployment
</commit_message>
<xml_diff>
--- a/DataIntrix_Consulting_Report.docx
+++ b/DataIntrix_Consulting_Report.docx
@@ -41,7 +41,7 @@
         <w:t>## Executive Summary</w:t>
         <w:br/>
         <w:br/>
-        <w:t>종합 분석 결과, 당사의 비즈니스 매출은 견고한 성장 추세를 보이며 매우 높은 예측 가능성을 지니고 있습니다. 특히 'THE BELLE SIGNATURE'는 총매출을 견인하는 핵심 동력이자 가장 안정적인 수익원(변동계수 25.27%)으로 확인되었습니다. 다중 회귀 분석 모델은 0.9986이라는 탁월한 설명력으로 'FACE', '프로모션', 'THE WELLBEING EDIT(ADD ON)' 또한 총매출에 유의미한 영향을 미침을 입증합니다. 이러한 데이터는 비즈니스의 전반적인 건전성과 함께, 특정 핵심 메뉴에 대한 전략적 집중이 성과 극대화에 필수적임을 시사합니다.</w:t>
+        <w:t>본 분석 결과, 총매출은 견조한 성장 추세에 있으며, 사업의 전반적인 건전성이 매우 양호함을 확인했습니다. 특히, 'THE BELLE SIGNATURE'는 매출에 가장 지대한 영향을 미치는 핵심 변수이며, 그 기여도와 안정성이 매우 높습니다. 'FACE', '프로모션', 'THE WELLBEING EDIT(ADD ON)' 또한 유의미한 매출 기여를 보이며, 이들 변수로 총매출의 99.86%를 설명할 수 있는 탁월한 예측력을 확보했습니다. 다만, '프로모션'은 매출에 긍정적인 영향을 미치지만, 변동계수가 175%에 달하여 운영 시 전략적 접근과 면밀한 관찰이 요구됩니다. 핵심 매출 동력원 관리를 통한 지속적인 성장이 기대되며, 변동성이 큰 항목에 대한 리스크 관리가 필요합니다.</w:t>
       </w:r>
     </w:p>
     <w:p>
@@ -132,7 +132,7 @@
         <w:jc w:val="center"/>
       </w:pPr>
       <w:r>
-        <w:t>월별 총매출은 상승 추세를 보이며, 추세 기울기는 약 495만으로 나타나 월별 매출이 점진적으로 증가하는 흐름을 보여줍니다. 해당 추세선의 결정계수 R2는 0.4635입니다.</w:t>
+        <w:t>월별 총매출은 긍정적인 추세 기울기(4,950,922.5)를 보이며 전반적인 상승 흐름을 나타내고 있습니다. 결정계수(R²)가 0.4635인 점은 해당 추세가 총매출 변동의 약 46%를 설명함을 보여줍니다.</w:t>
       </w:r>
     </w:p>
     <w:p>
@@ -192,7 +192,7 @@
         <w:jc w:val="center"/>
       </w:pPr>
       <w:r>
-        <w:t>데이터 분석 결과, 'THE BELLE SIGNATURE' 메뉴는 압도적으로 높은 평균 매출과 전체 매출에 대한 매우 강한 상관관계를 나타내며 핵심적인 캐시카우 메뉴입니다. 'FACE' 및 'SPA PACKAGE' 또한 높은 매출 기여도를 보이는 주요 메뉴로 파악됩니다.</w:t>
+        <w:t>`THE BELLE SIGNATURE` 메뉴는 월평균 약 6천 3백만원 이상의 매출로 가장 높은 비중을 차지하며, 총매출에 대한 설명력이 92% 이상으로 매우 높습니다. `FACE`와 `SPA PACKAGE` 메뉴 또한 높은 상관관계를 보이며 주요 매출원으로 기여하고 있으며, 이들 상위 메뉴들이 전체 매출을 견인하는 핵심적인 캐시카우입니다.</w:t>
       </w:r>
     </w:p>
     <w:p>
@@ -607,33 +607,35 @@
     </w:p>
     <w:p>
       <w:r>
-        <w:t>[강점] 매출핵심요소</w:t>
+        <w:t>[강점] 핵심성과</w:t>
         <w:br/>
-        <w:t>- 핵심 메뉴 기여도: 'THE BELLE SIGNATURE'는 총매출과 0.9604의 매우 높은 양의 상관관계를 가지며, 단순 회귀 분석 결정계수(R_squared)가 0.9224로 매출 설명력이 압도적으로 높습니다. 또한 변동계수가 25.27%로 가장 안정적인 매출을 보입니다.</w:t>
+        <w:t>- 핵심메뉴 기여: THE BELLE SIGNATURE는 총매출과 0.9604의 높은 상관관계를 보이며, 단순 회귀 분석에서 R_squared가 0.9224로 가장 높게 나타나 매출 견인에 핵심적인 역할을 합니다.</w:t>
         <w:br/>
-        <w:t>- 주력 메뉴 매출 견인: 'FACE' 메뉴는 총매출과 0.8109의 강한 양의 상관관계를 보이며, 단순 회귀 분석 결정계수가 0.6576으로 총매출에 유의미한 영향을 미칩니다. 'SPA PACKAGE' 또한 총매출 상관관계가 0.8048이고 변동계수가 40.32%로 안정적인 주요 매출원입니다.</w:t>
+        <w:t>- 안정적 매출: THE BELLE SIGNATURE는 변동계수(CV)가 25.27%로 가장 낮아 매출이 매우 안정적이고 예측 가능함을 보여줍니다.</w:t>
         <w:br/>
-        <w:t>- 전반적인 성장 추세: 총매출 추세 분석 결과, 추세 기울기가 4,950,922.5로 양의 값을 보여 전반적인 매출 증가 추세를 보입니다. 이는 사업의 긍정적인 성장 동력을 시사합니다.</w:t>
+        <w:t>- 매출 성장 추세: 전체 매출은 4,950,922.5의 긍정적인 추세 기울기를 가지며 꾸준히 성장하고 있음을 나타냅니다.</w:t>
+        <w:br/>
+        <w:t>- 예측 모델 정확도: 다중 회귀 모델의 R_squared_score가 0.9986으로, 주요 변수들이 총매출 변동의 거의 모든 부분을 설명하며 높은 예측력을 가집니다.</w:t>
         <w:br/>
         <w:br/>
-        <w:t>[약점] 개선필요요소</w:t>
+        <w:t>[약점] 보완필요</w:t>
         <w:br/>
-        <w:t>- 프로모션 역효과: '프로모션'은 총매출과 -0.5935의 음의 상관관계를 보이며, 단순 회귀 분석에서 음의 계수(-2.1776)를 가지고 있습니다. 이는 프로모션이 오히려 총매출에 부정적인 영향을 미칠 수 있음을 의미합니다.</w:t>
+        <w:t>- 프로모션 불안정성: 프로모션은 변동계수(CV)가 175.07%로 가장 높아 매출 기여도가 매우 불규칙하며, 총매출과 -0.5935의 음의 상관관계를 보입니다.</w:t>
         <w:br/>
-        <w:t>- 프로모션 매출 불안정성: '프로모션' 메뉴의 변동계수(CV)가 175.07%로 다른 메뉴들에 비해 월등히 높아 매출 변동성이 매우 큽니다. 이는 프로모션 효과의 예측 가능성이 낮고 관리가 어렵다는 것을 나타냅니다.</w:t>
+        <w:t>- 일부 메뉴 기여도 미미: BODY (P_value 0.2519), THE WELLBEING EDIT(ADD ON) (P_value 0.2521), 기타 (P_value 0.3507)는 단순 회귀 분석에서 P_value가 높아 개별적으로 총매출에 대한 통계적 유의미한 영향이 부족합니다.</w:t>
         <w:br/>
-        <w:t>- 저조한 개별 메뉴 영향력: 'BODY', 'THE WELLBEING EDIT(ADD ON)', '기타' 메뉴는 단순 회귀 분석에서 R_squared 값이 각각 0.1822, 0.1821, 0.125로 총매출에 대한 개별적인 설명력이 매우 낮습니다. 이 메뉴들은 현재 총매출에 직접적인 기여가 미미합니다.</w:t>
+        <w:t>- 종합 매출 추세 설명력 부족: 전체 매출 추세의 결정계수(R2)가 0.4635로, 시간 경과에 따른 매출 변화의 절반 미만을 설명하여 다른 외부 요인의 영향이 크다는 점을 시사합니다.</w:t>
         <w:br/>
         <w:br/>
-        <w:t>[개선 방향] 매출증대방안</w:t>
+        <w:t>[개선 방향] 전략제안</w:t>
         <w:br/>
-        <w:t>- 핵심 메뉴 중심 마케팅 강화: 'THE BELLE SIGNATURE'의 강력한 매출 기여도와 안정성을 바탕으로, 이 메뉴를 중심으로 한 프리미엄 마케팅 전략을 강화하여 고정 고객층을 더욱 확보해야 합니다. 이는 전체 매출을 견인하는 핵심 동력이 될 것입니다.</w:t>
+        <w:t>- 핵심메뉴 전략 강화: THE BELLE SIGNATURE의 높은 매출 기여도와 안정성(CV 25.27%)을 활용하여, 해당 메뉴를 중심으로 마케팅 및 프로모션 전략을 수립하고 FACE(상관관계 0.8109) 등 다른 인기 메뉴와의 연계 판매를 강화합니다.</w:t>
         <w:br/>
-        <w:t>- 프로모션 전략 전면 재검토: 현재 '프로모션'의 음의 상관관계 및 높은 변동성을 고려하여, 프로모션의 종류, 시기, 대상 등을 포괄적으로 재분석하고, 총매출 증대에 실질적으로 기여할 수 있는 새로운 프로모션 모델을 개발해야 합니다.</w:t>
+        <w:t>- 프로모션 효과 재설계: 현재 프로모션이 총매출과 음의 상관관계(-0.5935) 및 높은 변동성(CV 175.07%)을 보이므로, 프로모션의 구성, 대상, 시기 등을 재검토하여 실제 매출 증대에 긍정적으로 기여할 수 있도록 전략을 수정합니다.</w:t>
         <w:br/>
-        <w:t>- 비주력 메뉴 활성화 방안 수립: 'BODY', 'THE WELLBEING EDIT(ADD ON)', '기타'와 같이 총매출 기여도가 낮은 메뉴들에 대해서는 타겟 고객층 재설정, 상품 구성 변경, 혹은 고성과 메뉴와의 연계 판매(번들링) 등을 통해 판매를 촉진하는 전략을 수립해야 합니다.</w:t>
+        <w:t>- 비주력 메뉴 활성화: BODY, THE WELLBEING EDIT(ADD ON), 기타 등 통계적 유의미성이 낮은 메뉴(P_value 0.25 이상)에 대해 고객 피드백을 수집하고, 가격 조정, 번들 상품 개발, 또는 프로모션 대상 포함 등 판매 전략을 재구축하여 기여도를 높입니다.</w:t>
         <w:br/>
-        <w:t>- 안정적 메뉴의 지속적인 관리: 'FACE'와 'SPA PACKAGE' 메뉴의 높은 상관관계와 상대적인 안정성을 고려하여, 고객 만족도 유지 및 재구매율 향상을 위한 CRM 전략을 강화해야 합니다. 이를 통해 꾸준한 매출 흐름을 유지할 수 있습니다.</w:t>
+        <w:t>- 종합 매출 기여 요소 심층 분석: 전체 매출 추세의 낮은 설명력(R2 0.4635)을 보완하기 위해, 계절성, 요일별 패턴, 외부 마케팅 활동, 고객 리뷰 등 다양한 외부 요인 데이터를 추가 분석하여 매출에 영향을 미치는 숨겨진 요소를 발굴하고 전략에 반영합니다.</w:t>
       </w:r>
     </w:p>
     <w:sectPr>

</xml_diff>